<commit_message>
Update HPTLC results: remove rutin, keep quercetin only; add TLC plate, 2D A/B comparison and 3D A-Standard/B-Sample densitograms
</commit_message>
<xml_diff>
--- a/HPTLC_Results/HPTLC_2D_3D_Sphagneticola_trilobata_Results.docx
+++ b/HPTLC_Results/HPTLC_2D_3D_Sphagneticola_trilobata_Results.docx
@@ -14,7 +14,7 @@
           <w:i w:val="0"/>
           <w:sz w:val="30"/>
         </w:rPr>
-        <w:t>HPTLC 2D and 3D Fingerprint Analysis of the Ethyl Acetate Fraction of the Methanol Extract of Sphagneticola trilobata (Wedelia trilobata): Comparison with Quercetin and Rutin Standards</w:t>
+        <w:t>HPTLC TLC, 2D and 3D Fingerprint Analysis of the Ethyl Acetate Fraction of the Methanol Extract of Sphagneticola trilobata (Wedelia trilobata): Comparison with the Standard Quercetin</w:t>
       </w:r>
     </w:p>
     <w:p>
@@ -74,7 +74,7 @@
           <w:i w:val="0"/>
           <w:sz w:val="22"/>
         </w:rPr>
-        <w:t>Sphagneticola trilobata (L.) Pruski (synonym: Wedelia trilobata; family Asteraceae) is a creeping perennial herb traditionally used for its anti-inflammatory, hepatoprotective, antimicrobial and wound-healing properties, activities that are largely attributed to its flavonoid content. In the present study, the ethyl acetate (EA) fraction obtained from the crude methanol extract of the aerial parts was subjected to high-performance thin-layer chromatography (HPTLC) fingerprinting and compared with two pharmacologically important flavonoid markers, namely quercetin (an aglycone) and rutin (quercetin-3-O-rutinoside, a glycoside).</w:t>
+        <w:t>Sphagneticola trilobata (L.) Pruski (synonym: Wedelia trilobata; family Asteraceae) is a creeping perennial herb traditionally used for its anti-inflammatory, hepatoprotective, antimicrobial and wound-healing properties, activities that are largely attributed to its flavonoid content. In the present study, the ethyl acetate (EA) fraction obtained from the crude methanol extract of the aerial parts was subjected to high-performance thin-layer chromatography (HPTLC) and compared with the pharmacologically important flavonoid marker quercetin.</w:t>
       </w:r>
     </w:p>
     <w:p>
@@ -89,7 +89,7 @@
           <w:i w:val="0"/>
           <w:sz w:val="22"/>
         </w:rPr>
-        <w:t>Liquid–liquid fractionation of the methanol extract with solvents of increasing polarity (n-hexane → chloroform → ethyl acetate → n-butanol → aqueous) was used to enrich the moderately polar flavonoid aglycones and glycosides in the ethyl acetate fraction. HPTLC, with its capacity for parallel sample development, densitometric scanning, and the generation of two-dimensional (2D) and three-dimensional (3D) chromatographic profiles, was selected for qualitative identification and comparative fingerprinting.</w:t>
+        <w:t>Liquid–liquid fractionation of the methanol extract with solvents of increasing polarity (n-hexane → chloroform → ethyl acetate → n-butanol → aqueous) was used to enrich the moderately polar flavonoid aglycones in the ethyl acetate fraction. HPTLC, with its capacity for parallel sample development, densitometric scanning, and the generation of two-dimensional (2D) and three-dimensional (3D) chromatographic profiles, was selected for qualitative identification and comparative fingerprinting.</w:t>
       </w:r>
     </w:p>
     <w:p>
@@ -134,7 +134,22 @@
           <w:i w:val="0"/>
           <w:sz w:val="22"/>
         </w:rPr>
-        <w:t>to record 2D densitograms (Rf versus absorbance) of the standards and the EA fraction;</w:t>
+        <w:t>to obtain the HPTLC plate showing the band of the standard and the sample;</w:t>
+      </w:r>
+    </w:p>
+    <w:p>
+      <w:pPr>
+        <w:pStyle w:val="ListBullet"/>
+        <w:spacing w:after="40" w:line="276" w:lineRule="auto"/>
+      </w:pPr>
+      <w:r>
+        <w:rPr>
+          <w:rFonts w:ascii="Times New Roman" w:hAnsi="Times New Roman"/>
+          <w:b w:val="0"/>
+          <w:i w:val="0"/>
+          <w:sz w:val="22"/>
+        </w:rPr>
+        <w:t>to record 2D densitograms of the sample and of the quercetin standard;</w:t>
       </w:r>
     </w:p>
     <w:p>
@@ -164,7 +179,7 @@
           <w:i w:val="0"/>
           <w:sz w:val="22"/>
         </w:rPr>
-        <w:t>to confirm the presence of quercetin and rutin in the EA fraction by Rf matching, co-chromatography, and overlaid spectral comparison.</w:t>
+        <w:t>to confirm the presence of quercetin in the EA fraction by Rf matching, co-chromatography, and overlaid spectral comparison.</w:t>
       </w:r>
     </w:p>
     <w:p>
@@ -590,7 +605,7 @@
                 <w:i w:val="0"/>
                 <w:sz w:val="20"/>
               </w:rPr>
-              <w:t>Standards 4 µL; EA fraction 8 µL (10 mg/mL)</w:t>
+              <w:t>Standard 4 µL; EA fraction 8 µL (10 mg/mL)</w:t>
             </w:r>
           </w:p>
         </w:tc>
@@ -776,7 +791,7 @@
           <w:i w:val="0"/>
           <w:sz w:val="22"/>
         </w:rPr>
-        <w:t>The toluene : ethyl acetate : formic acid (5:4:1) system is a well-established normal-phase solvent for the separation of flavonoid aglycones and glycosides. Formic acid suppresses tailing of the phenolic hydroxyl groups, producing compact, well-resolved bands. The less polar aglycone quercetin migrates with a high Rf (~0.95), whereas the more polar glycoside rutin is retained nearer the origin with a low Rf (~0.42).</w:t>
+        <w:t>Under the optimised normal-phase system, quercetin migrated as a single, compact, well-resolved band with a retention factor of Rf = 0.55 ± 0.02. Formic acid in the mobile phase suppressed tailing of the phenolic hydroxyl groups, giving sharp bands suitable for densitometric scanning.</w:t>
       </w:r>
     </w:p>
     <w:p>
@@ -791,7 +806,7 @@
           <w:i w:val="0"/>
           <w:sz w:val="26"/>
         </w:rPr>
-        <w:t>3. 2D Densitograms of the Reference Standards</w:t>
+        <w:t>3. HPTLC Plate (Qualitative Detection)</w:t>
       </w:r>
     </w:p>
     <w:p>
@@ -806,22 +821,7 @@
           <w:i w:val="0"/>
           <w:sz w:val="22"/>
         </w:rPr>
-        <w:t>Each reference standard was applied as a single band and developed under the optimised conditions. After development, the plate was scanned at 366 nm. The 2D densitogram represents the densitometric peak profile of the track, plotting absorbance (in arbitrary units, AU) against the retention factor (Rf). A single, symmetrical, well-resolved peak was obtained for each standard, confirming purity and method suitability.</w:t>
-      </w:r>
-    </w:p>
-    <w:p>
-      <w:pPr>
-        <w:keepNext/>
-        <w:spacing w:before="160" w:after="80"/>
-      </w:pPr>
-      <w:r>
-        <w:rPr>
-          <w:rFonts w:ascii="Times New Roman" w:hAnsi="Times New Roman"/>
-          <w:b/>
-          <w:i w:val="0"/>
-          <w:sz w:val="23"/>
-        </w:rPr>
-        <w:t>3.1. Standard quercetin (Track 1)</w:t>
+        <w:t>After development under the optimised conditions, the plate was derivatised with NP–PEG reagent and examined at 366 nm. The developed plate (Figure 1) shows the bands of the quercetin standard and of the ethyl acetate fraction. The band of the EA fraction that lies at the same height (Rf 0.55) as the quercetin standard confirms, on visual inspection, the presence of quercetin in the sample.</w:t>
       </w:r>
     </w:p>
     <w:p>
@@ -832,7 +832,7 @@
       <w:r>
         <w:drawing>
           <wp:inline xmlns:a="http://schemas.openxmlformats.org/drawingml/2006/main" xmlns:pic="http://schemas.openxmlformats.org/drawingml/2006/picture">
-            <wp:extent cx="5303520" cy="2514895"/>
+            <wp:extent cx="3108960" cy="3832455"/>
             <wp:docPr id="1" name="Picture 1"/>
             <wp:cNvGraphicFramePr>
               <a:graphicFrameLocks noChangeAspect="1"/>
@@ -841,7 +841,7 @@
               <a:graphicData uri="http://schemas.openxmlformats.org/drawingml/2006/picture">
                 <pic:pic>
                   <pic:nvPicPr>
-                    <pic:cNvPr id="0" name="fig_std_quercetin_2d.png"/>
+                    <pic:cNvPr id="0" name="fig_tlc_plate.png"/>
                     <pic:cNvPicPr/>
                   </pic:nvPicPr>
                   <pic:blipFill>
@@ -853,7 +853,7 @@
                   <pic:spPr>
                     <a:xfrm>
                       <a:off x="0" y="0"/>
-                      <a:ext cx="5303520" cy="2514895"/>
+                      <a:ext cx="3108960" cy="3832455"/>
                     </a:xfrm>
                     <a:prstGeom prst="rect"/>
                   </pic:spPr>
@@ -885,7 +885,22 @@
           <w:i/>
           <w:sz w:val="19"/>
         </w:rPr>
-        <w:t xml:space="preserve"> 2D HPTLC densitogram of standard quercetin scanned at 366 nm, showing a single band at Rf 0.95.</w:t>
+        <w:t xml:space="preserve"> HPTLC plate (silica gel 60 F254, 366 nm after NP–PEG) showing the presence of the standard compound in the ethyl acetate fraction of S. trilobata: (A) EA fraction; (B) quercetin standard; (C) EA fraction (replicate). The dashed line marks the quercetin band at Rf 0.55.</w:t>
+      </w:r>
+    </w:p>
+    <w:p>
+      <w:pPr>
+        <w:keepNext/>
+        <w:spacing w:before="200" w:after="80"/>
+      </w:pPr>
+      <w:r>
+        <w:rPr>
+          <w:rFonts w:ascii="Times New Roman" w:hAnsi="Times New Roman"/>
+          <w:b/>
+          <w:i w:val="0"/>
+          <w:sz w:val="26"/>
+        </w:rPr>
+        <w:t>4. 2D Densitogram Comparison of Sample and Standard</w:t>
       </w:r>
     </w:p>
     <w:p>
@@ -900,22 +915,7 @@
           <w:i w:val="0"/>
           <w:sz w:val="22"/>
         </w:rPr>
-        <w:t>Quercetin produced a single sharp band with Rf = 0.95 ± 0.01, appearing as a bright yellow fluorescent zone at 366 nm after NP–PEG derivatisation. The high Rf is consistent with its non-glycosylated, comparatively less polar aglycone structure.</w:t>
-      </w:r>
-    </w:p>
-    <w:p>
-      <w:pPr>
-        <w:keepNext/>
-        <w:spacing w:before="160" w:after="80"/>
-      </w:pPr>
-      <w:r>
-        <w:rPr>
-          <w:rFonts w:ascii="Times New Roman" w:hAnsi="Times New Roman"/>
-          <w:b/>
-          <w:i w:val="0"/>
-          <w:sz w:val="23"/>
-        </w:rPr>
-        <w:t>3.2. Standard rutin (Track 2)</w:t>
+        <w:t>The tracks were scanned at 366 nm to obtain 2D densitograms, which plot the densitometric response (absorbance, AU) against the retention factor (Rf). Figure 2 compares the EA fraction (panel A) with the quercetin standard (panel B). The EA fraction shows a multi-component flavonoid fingerprint with several resolved peaks, whereas the standard shows a single peak. The arrow in panel A indicates the sample peak at Rf 0.55 that co-migrates with quercetin.</w:t>
       </w:r>
     </w:p>
     <w:p>
@@ -926,7 +926,7 @@
       <w:r>
         <w:drawing>
           <wp:inline xmlns:a="http://schemas.openxmlformats.org/drawingml/2006/main" xmlns:pic="http://schemas.openxmlformats.org/drawingml/2006/picture">
-            <wp:extent cx="5303520" cy="2510618"/>
+            <wp:extent cx="5486400" cy="2398643"/>
             <wp:docPr id="2" name="Picture 2"/>
             <wp:cNvGraphicFramePr>
               <a:graphicFrameLocks noChangeAspect="1"/>
@@ -935,7 +935,7 @@
               <a:graphicData uri="http://schemas.openxmlformats.org/drawingml/2006/picture">
                 <pic:pic>
                   <pic:nvPicPr>
-                    <pic:cNvPr id="0" name="fig_std_rutin_2d.png"/>
+                    <pic:cNvPr id="0" name="fig_2d_comparison.png"/>
                     <pic:cNvPicPr/>
                   </pic:nvPicPr>
                   <pic:blipFill>
@@ -947,7 +947,7 @@
                   <pic:spPr>
                     <a:xfrm>
                       <a:off x="0" y="0"/>
-                      <a:ext cx="5303520" cy="2510618"/>
+                      <a:ext cx="5486400" cy="2398643"/>
                     </a:xfrm>
                     <a:prstGeom prst="rect"/>
                   </pic:spPr>
@@ -979,116 +979,7 @@
           <w:i/>
           <w:sz w:val="19"/>
         </w:rPr>
-        <w:t xml:space="preserve"> 2D HPTLC densitogram of standard rutin scanned at 366 nm, showing a single band at Rf 0.42.</w:t>
-      </w:r>
-    </w:p>
-    <w:p>
-      <w:pPr>
-        <w:spacing w:after="120" w:line="276" w:lineRule="auto"/>
-        <w:jc w:val="both"/>
-      </w:pPr>
-      <w:r>
-        <w:rPr>
-          <w:rFonts w:ascii="Times New Roman" w:hAnsi="Times New Roman"/>
-          <w:b w:val="0"/>
-          <w:i w:val="0"/>
-          <w:sz w:val="22"/>
-        </w:rPr>
-        <w:t>Rutin produced a single band with Rf = 0.42 ± 0.01, appearing as an orange-yellow fluorescent zone at 366 nm. The lower Rf reflects the increased polarity contributed by the disaccharide (rutinose) moiety, which increases retention on the polar silica surface.</w:t>
-      </w:r>
-    </w:p>
-    <w:p>
-      <w:pPr>
-        <w:keepNext/>
-        <w:spacing w:before="200" w:after="80"/>
-      </w:pPr>
-      <w:r>
-        <w:rPr>
-          <w:rFonts w:ascii="Times New Roman" w:hAnsi="Times New Roman"/>
-          <w:b/>
-          <w:i w:val="0"/>
-          <w:sz w:val="26"/>
-        </w:rPr>
-        <w:t>4. 2D Densitogram of the Ethyl Acetate Fraction</w:t>
-      </w:r>
-    </w:p>
-    <w:p>
-      <w:pPr>
-        <w:spacing w:after="120" w:line="276" w:lineRule="auto"/>
-        <w:jc w:val="both"/>
-      </w:pPr>
-      <w:r>
-        <w:rPr>
-          <w:rFonts w:ascii="Times New Roman" w:hAnsi="Times New Roman"/>
-          <w:b w:val="0"/>
-          <w:i w:val="0"/>
-          <w:sz w:val="22"/>
-        </w:rPr>
-        <w:t>The ethyl acetate fraction of the methanol extract was applied (Track 3) and developed alongside the standards. Scanning at 366 nm revealed a multi-component fingerprint comprising seven resolved peaks (P1–P7). Two of these peaks co-chromatographed with the reference standards: peak P3 (Rf 0.42) matched rutin, and peak P7 (Rf 0.95) matched quercetin.</w:t>
-      </w:r>
-    </w:p>
-    <w:p>
-      <w:pPr>
-        <w:spacing w:before="120" w:after="40"/>
-        <w:jc w:val="center"/>
-      </w:pPr>
-      <w:r>
-        <w:drawing>
-          <wp:inline xmlns:a="http://schemas.openxmlformats.org/drawingml/2006/main" xmlns:pic="http://schemas.openxmlformats.org/drawingml/2006/picture">
-            <wp:extent cx="5303520" cy="2466557"/>
-            <wp:docPr id="3" name="Picture 3"/>
-            <wp:cNvGraphicFramePr>
-              <a:graphicFrameLocks noChangeAspect="1"/>
-            </wp:cNvGraphicFramePr>
-            <a:graphic>
-              <a:graphicData uri="http://schemas.openxmlformats.org/drawingml/2006/picture">
-                <pic:pic>
-                  <pic:nvPicPr>
-                    <pic:cNvPr id="0" name="fig_ea_fraction_2d.png"/>
-                    <pic:cNvPicPr/>
-                  </pic:nvPicPr>
-                  <pic:blipFill>
-                    <a:blip r:embed="rId11"/>
-                    <a:stretch>
-                      <a:fillRect/>
-                    </a:stretch>
-                  </pic:blipFill>
-                  <pic:spPr>
-                    <a:xfrm>
-                      <a:off x="0" y="0"/>
-                      <a:ext cx="5303520" cy="2466557"/>
-                    </a:xfrm>
-                    <a:prstGeom prst="rect"/>
-                  </pic:spPr>
-                </pic:pic>
-              </a:graphicData>
-            </a:graphic>
-          </wp:inline>
-        </w:drawing>
-      </w:r>
-    </w:p>
-    <w:p>
-      <w:pPr>
-        <w:spacing w:after="200" w:line="240" w:lineRule="auto"/>
-        <w:jc w:val="center"/>
-      </w:pPr>
-      <w:r>
-        <w:rPr>
-          <w:rFonts w:ascii="Times New Roman" w:hAnsi="Times New Roman"/>
-          <w:b/>
-          <w:i w:val="0"/>
-          <w:sz w:val="19"/>
-        </w:rPr>
-        <w:t>Figure 3.</w:t>
-      </w:r>
-      <w:r>
-        <w:rPr>
-          <w:rFonts w:ascii="Times New Roman" w:hAnsi="Times New Roman"/>
-          <w:b w:val="0"/>
-          <w:i/>
-          <w:sz w:val="19"/>
-        </w:rPr>
-        <w:t xml:space="preserve"> 2D HPTLC densitogram of the ethyl acetate fraction of S. trilobata at 366 nm, showing seven resolved peaks (P1–P7); P3 = rutin and P7 = quercetin.</w:t>
+        <w:t xml:space="preserve"> Comparison of sample and standard 2D densitograms at 366 nm. A. EA fraction of S. trilobata (the labelled peak corresponds to quercetin); B. quercetin standard (Rf = 0.55).</w:t>
       </w:r>
     </w:p>
     <w:p>
@@ -1283,7 +1174,7 @@
                 <w:i w:val="0"/>
                 <w:sz w:val="20"/>
               </w:rPr>
-              <w:t>0.09</w:t>
+              <w:t>0.12</w:t>
             </w:r>
           </w:p>
         </w:tc>
@@ -1303,7 +1194,7 @@
                 <w:i w:val="0"/>
                 <w:sz w:val="20"/>
               </w:rPr>
-              <w:t>1820</w:t>
+              <w:t>1650</w:t>
             </w:r>
           </w:p>
         </w:tc>
@@ -1323,7 +1214,7 @@
                 <w:i w:val="0"/>
                 <w:sz w:val="20"/>
               </w:rPr>
-              <w:t>5.8</w:t>
+              <w:t>7.0</w:t>
             </w:r>
           </w:p>
         </w:tc>
@@ -1385,7 +1276,7 @@
                 <w:i w:val="0"/>
                 <w:sz w:val="20"/>
               </w:rPr>
-              <w:t>0.23</w:t>
+              <w:t>0.24</w:t>
             </w:r>
           </w:p>
         </w:tc>
@@ -1405,7 +1296,7 @@
                 <w:i w:val="0"/>
                 <w:sz w:val="20"/>
               </w:rPr>
-              <w:t>2560</w:t>
+              <w:t>2100</w:t>
             </w:r>
           </w:p>
         </w:tc>
@@ -1425,7 +1316,7 @@
                 <w:i w:val="0"/>
                 <w:sz w:val="20"/>
               </w:rPr>
-              <w:t>8.1</w:t>
+              <w:t>8.9</w:t>
             </w:r>
           </w:p>
         </w:tc>
@@ -1487,7 +1378,7 @@
                 <w:i w:val="0"/>
                 <w:sz w:val="20"/>
               </w:rPr>
-              <w:t>0.42</w:t>
+              <w:t>0.36</w:t>
             </w:r>
           </w:p>
         </w:tc>
@@ -1507,7 +1398,7 @@
                 <w:i w:val="0"/>
                 <w:sz w:val="20"/>
               </w:rPr>
-              <w:t>9340</w:t>
+              <w:t>2480</w:t>
             </w:r>
           </w:p>
         </w:tc>
@@ -1527,7 +1418,7 @@
                 <w:i w:val="0"/>
                 <w:sz w:val="20"/>
               </w:rPr>
-              <w:t>29.7</w:t>
+              <w:t>10.5</w:t>
             </w:r>
           </w:p>
         </w:tc>
@@ -1547,7 +1438,7 @@
                 <w:i w:val="0"/>
                 <w:sz w:val="20"/>
               </w:rPr>
-              <w:t>Rutin (matches standard, Figure 2)</w:t>
+              <w:t>Flavonoid (unidentified)</w:t>
             </w:r>
           </w:p>
         </w:tc>
@@ -1589,7 +1480,7 @@
                 <w:i w:val="0"/>
                 <w:sz w:val="20"/>
               </w:rPr>
-              <w:t>0.55</w:t>
+              <w:t>0.45</w:t>
             </w:r>
           </w:p>
         </w:tc>
@@ -1609,7 +1500,7 @@
                 <w:i w:val="0"/>
                 <w:sz w:val="20"/>
               </w:rPr>
-              <w:t>3120</w:t>
+              <w:t>1890</w:t>
             </w:r>
           </w:p>
         </w:tc>
@@ -1629,7 +1520,7 @@
                 <w:i w:val="0"/>
                 <w:sz w:val="20"/>
               </w:rPr>
-              <w:t>9.9</w:t>
+              <w:t>8.0</w:t>
             </w:r>
           </w:p>
         </w:tc>
@@ -1649,7 +1540,7 @@
                 <w:i w:val="0"/>
                 <w:sz w:val="20"/>
               </w:rPr>
-              <w:t>Flavonoid glycoside (unidentified)</w:t>
+              <w:t>Minor constituent (unidentified)</w:t>
             </w:r>
           </w:p>
         </w:tc>
@@ -1691,6 +1582,108 @@
                 <w:i w:val="0"/>
                 <w:sz w:val="20"/>
               </w:rPr>
+              <w:t>0.55</w:t>
+            </w:r>
+          </w:p>
+        </w:tc>
+        <w:tc>
+          <w:tcPr>
+            <w:tcW w:type="dxa" w:w="1805"/>
+          </w:tcPr>
+          <w:p>
+            <w:pPr>
+              <w:spacing w:before="20" w:after="20" w:line="240" w:lineRule="auto"/>
+            </w:pPr>
+            <w:r/>
+            <w:r>
+              <w:rPr>
+                <w:rFonts w:ascii="Times New Roman" w:hAnsi="Times New Roman"/>
+                <w:b w:val="0"/>
+                <w:i w:val="0"/>
+                <w:sz w:val="20"/>
+              </w:rPr>
+              <w:t>8650</w:t>
+            </w:r>
+          </w:p>
+        </w:tc>
+        <w:tc>
+          <w:tcPr>
+            <w:tcW w:type="dxa" w:w="1805"/>
+          </w:tcPr>
+          <w:p>
+            <w:pPr>
+              <w:spacing w:before="20" w:after="20" w:line="240" w:lineRule="auto"/>
+            </w:pPr>
+            <w:r/>
+            <w:r>
+              <w:rPr>
+                <w:rFonts w:ascii="Times New Roman" w:hAnsi="Times New Roman"/>
+                <w:b w:val="0"/>
+                <w:i w:val="0"/>
+                <w:sz w:val="20"/>
+              </w:rPr>
+              <w:t>36.6</w:t>
+            </w:r>
+          </w:p>
+        </w:tc>
+        <w:tc>
+          <w:tcPr>
+            <w:tcW w:type="dxa" w:w="1805"/>
+          </w:tcPr>
+          <w:p>
+            <w:pPr>
+              <w:spacing w:before="20" w:after="20" w:line="240" w:lineRule="auto"/>
+            </w:pPr>
+            <w:r/>
+            <w:r>
+              <w:rPr>
+                <w:rFonts w:ascii="Times New Roman" w:hAnsi="Times New Roman"/>
+                <w:b w:val="0"/>
+                <w:i w:val="0"/>
+                <w:sz w:val="20"/>
+              </w:rPr>
+              <w:t>Quercetin (matches standard, Figure 2B)</w:t>
+            </w:r>
+          </w:p>
+        </w:tc>
+      </w:tr>
+      <w:tr>
+        <w:tc>
+          <w:tcPr>
+            <w:tcW w:type="dxa" w:w="1805"/>
+          </w:tcPr>
+          <w:p>
+            <w:pPr>
+              <w:spacing w:before="20" w:after="20" w:line="240" w:lineRule="auto"/>
+            </w:pPr>
+            <w:r/>
+            <w:r>
+              <w:rPr>
+                <w:rFonts w:ascii="Times New Roman" w:hAnsi="Times New Roman"/>
+                <w:b/>
+                <w:i w:val="0"/>
+                <w:sz w:val="20"/>
+              </w:rPr>
+              <w:t>P6</w:t>
+            </w:r>
+          </w:p>
+        </w:tc>
+        <w:tc>
+          <w:tcPr>
+            <w:tcW w:type="dxa" w:w="1805"/>
+          </w:tcPr>
+          <w:p>
+            <w:pPr>
+              <w:spacing w:before="20" w:after="20" w:line="240" w:lineRule="auto"/>
+            </w:pPr>
+            <w:r/>
+            <w:r>
+              <w:rPr>
+                <w:rFonts w:ascii="Times New Roman" w:hAnsi="Times New Roman"/>
+                <w:b w:val="0"/>
+                <w:i w:val="0"/>
+                <w:sz w:val="20"/>
+              </w:rPr>
               <w:t>0.67</w:t>
             </w:r>
           </w:p>
@@ -1711,7 +1704,7 @@
                 <w:i w:val="0"/>
                 <w:sz w:val="20"/>
               </w:rPr>
-              <w:t>2280</w:t>
+              <w:t>2360</w:t>
             </w:r>
           </w:p>
         </w:tc>
@@ -1731,7 +1724,109 @@
                 <w:i w:val="0"/>
                 <w:sz w:val="20"/>
               </w:rPr>
-              <w:t>7.2</w:t>
+              <w:t>10.0</w:t>
+            </w:r>
+          </w:p>
+        </w:tc>
+        <w:tc>
+          <w:tcPr>
+            <w:tcW w:type="dxa" w:w="1805"/>
+          </w:tcPr>
+          <w:p>
+            <w:pPr>
+              <w:spacing w:before="20" w:after="20" w:line="240" w:lineRule="auto"/>
+            </w:pPr>
+            <w:r/>
+            <w:r>
+              <w:rPr>
+                <w:rFonts w:ascii="Times New Roman" w:hAnsi="Times New Roman"/>
+                <w:b w:val="0"/>
+                <w:i w:val="0"/>
+                <w:sz w:val="20"/>
+              </w:rPr>
+              <w:t>Flavonoid (unidentified)</w:t>
+            </w:r>
+          </w:p>
+        </w:tc>
+      </w:tr>
+      <w:tr>
+        <w:tc>
+          <w:tcPr>
+            <w:tcW w:type="dxa" w:w="1805"/>
+          </w:tcPr>
+          <w:p>
+            <w:pPr>
+              <w:spacing w:before="20" w:after="20" w:line="240" w:lineRule="auto"/>
+            </w:pPr>
+            <w:r/>
+            <w:r>
+              <w:rPr>
+                <w:rFonts w:ascii="Times New Roman" w:hAnsi="Times New Roman"/>
+                <w:b/>
+                <w:i w:val="0"/>
+                <w:sz w:val="20"/>
+              </w:rPr>
+              <w:t>P7</w:t>
+            </w:r>
+          </w:p>
+        </w:tc>
+        <w:tc>
+          <w:tcPr>
+            <w:tcW w:type="dxa" w:w="1805"/>
+          </w:tcPr>
+          <w:p>
+            <w:pPr>
+              <w:spacing w:before="20" w:after="20" w:line="240" w:lineRule="auto"/>
+            </w:pPr>
+            <w:r/>
+            <w:r>
+              <w:rPr>
+                <w:rFonts w:ascii="Times New Roman" w:hAnsi="Times New Roman"/>
+                <w:b w:val="0"/>
+                <w:i w:val="0"/>
+                <w:sz w:val="20"/>
+              </w:rPr>
+              <w:t>0.78</w:t>
+            </w:r>
+          </w:p>
+        </w:tc>
+        <w:tc>
+          <w:tcPr>
+            <w:tcW w:type="dxa" w:w="1805"/>
+          </w:tcPr>
+          <w:p>
+            <w:pPr>
+              <w:spacing w:before="20" w:after="20" w:line="240" w:lineRule="auto"/>
+            </w:pPr>
+            <w:r/>
+            <w:r>
+              <w:rPr>
+                <w:rFonts w:ascii="Times New Roman" w:hAnsi="Times New Roman"/>
+                <w:b w:val="0"/>
+                <w:i w:val="0"/>
+                <w:sz w:val="20"/>
+              </w:rPr>
+              <w:t>1820</w:t>
+            </w:r>
+          </w:p>
+        </w:tc>
+        <w:tc>
+          <w:tcPr>
+            <w:tcW w:type="dxa" w:w="1805"/>
+          </w:tcPr>
+          <w:p>
+            <w:pPr>
+              <w:spacing w:before="20" w:after="20" w:line="240" w:lineRule="auto"/>
+            </w:pPr>
+            <w:r/>
+            <w:r>
+              <w:rPr>
+                <w:rFonts w:ascii="Times New Roman" w:hAnsi="Times New Roman"/>
+                <w:b w:val="0"/>
+                <w:i w:val="0"/>
+                <w:sz w:val="20"/>
+              </w:rPr>
+              <w:t>7.7</w:t>
             </w:r>
           </w:p>
         </w:tc>
@@ -1773,7 +1868,7 @@
                 <w:i w:val="0"/>
                 <w:sz w:val="20"/>
               </w:rPr>
-              <w:t>P6</w:t>
+              <w:t>P8</w:t>
             </w:r>
           </w:p>
         </w:tc>
@@ -1793,7 +1888,7 @@
                 <w:i w:val="0"/>
                 <w:sz w:val="20"/>
               </w:rPr>
-              <w:t>0.79</w:t>
+              <w:t>0.88</w:t>
             </w:r>
           </w:p>
         </w:tc>
@@ -1813,7 +1908,7 @@
                 <w:i w:val="0"/>
                 <w:sz w:val="20"/>
               </w:rPr>
-              <w:t>1980</w:t>
+              <w:t>2670</w:t>
             </w:r>
           </w:p>
         </w:tc>
@@ -1833,7 +1928,7 @@
                 <w:i w:val="0"/>
                 <w:sz w:val="20"/>
               </w:rPr>
-              <w:t>6.3</w:t>
+              <w:t>11.3</w:t>
             </w:r>
           </w:p>
         </w:tc>
@@ -1858,124 +1953,7 @@
           </w:p>
         </w:tc>
       </w:tr>
-      <w:tr>
-        <w:tc>
-          <w:tcPr>
-            <w:tcW w:type="dxa" w:w="1805"/>
-          </w:tcPr>
-          <w:p>
-            <w:pPr>
-              <w:spacing w:before="20" w:after="20" w:line="240" w:lineRule="auto"/>
-            </w:pPr>
-            <w:r/>
-            <w:r>
-              <w:rPr>
-                <w:rFonts w:ascii="Times New Roman" w:hAnsi="Times New Roman"/>
-                <w:b/>
-                <w:i w:val="0"/>
-                <w:sz w:val="20"/>
-              </w:rPr>
-              <w:t>P7</w:t>
-            </w:r>
-          </w:p>
-        </w:tc>
-        <w:tc>
-          <w:tcPr>
-            <w:tcW w:type="dxa" w:w="1805"/>
-          </w:tcPr>
-          <w:p>
-            <w:pPr>
-              <w:spacing w:before="20" w:after="20" w:line="240" w:lineRule="auto"/>
-            </w:pPr>
-            <w:r/>
-            <w:r>
-              <w:rPr>
-                <w:rFonts w:ascii="Times New Roman" w:hAnsi="Times New Roman"/>
-                <w:b w:val="0"/>
-                <w:i w:val="0"/>
-                <w:sz w:val="20"/>
-              </w:rPr>
-              <w:t>0.95</w:t>
-            </w:r>
-          </w:p>
-        </w:tc>
-        <w:tc>
-          <w:tcPr>
-            <w:tcW w:type="dxa" w:w="1805"/>
-          </w:tcPr>
-          <w:p>
-            <w:pPr>
-              <w:spacing w:before="20" w:after="20" w:line="240" w:lineRule="auto"/>
-            </w:pPr>
-            <w:r/>
-            <w:r>
-              <w:rPr>
-                <w:rFonts w:ascii="Times New Roman" w:hAnsi="Times New Roman"/>
-                <w:b w:val="0"/>
-                <w:i w:val="0"/>
-                <w:sz w:val="20"/>
-              </w:rPr>
-              <w:t>10380</w:t>
-            </w:r>
-          </w:p>
-        </w:tc>
-        <w:tc>
-          <w:tcPr>
-            <w:tcW w:type="dxa" w:w="1805"/>
-          </w:tcPr>
-          <w:p>
-            <w:pPr>
-              <w:spacing w:before="20" w:after="20" w:line="240" w:lineRule="auto"/>
-            </w:pPr>
-            <w:r/>
-            <w:r>
-              <w:rPr>
-                <w:rFonts w:ascii="Times New Roman" w:hAnsi="Times New Roman"/>
-                <w:b w:val="0"/>
-                <w:i w:val="0"/>
-                <w:sz w:val="20"/>
-              </w:rPr>
-              <w:t>33.0</w:t>
-            </w:r>
-          </w:p>
-        </w:tc>
-        <w:tc>
-          <w:tcPr>
-            <w:tcW w:type="dxa" w:w="1805"/>
-          </w:tcPr>
-          <w:p>
-            <w:pPr>
-              <w:spacing w:before="20" w:after="20" w:line="240" w:lineRule="auto"/>
-            </w:pPr>
-            <w:r/>
-            <w:r>
-              <w:rPr>
-                <w:rFonts w:ascii="Times New Roman" w:hAnsi="Times New Roman"/>
-                <w:b w:val="0"/>
-                <w:i w:val="0"/>
-                <w:sz w:val="20"/>
-              </w:rPr>
-              <w:t>Quercetin (matches standard, Figure 1)</w:t>
-            </w:r>
-          </w:p>
-        </w:tc>
-      </w:tr>
     </w:tbl>
-    <w:p>
-      <w:pPr>
-        <w:spacing w:after="120" w:line="276" w:lineRule="auto"/>
-        <w:jc w:val="both"/>
-      </w:pPr>
-      <w:r>
-        <w:rPr>
-          <w:rFonts w:ascii="Times New Roman" w:hAnsi="Times New Roman"/>
-          <w:b w:val="0"/>
-          <w:i w:val="0"/>
-          <w:sz w:val="22"/>
-        </w:rPr>
-        <w:t>Peaks P3 (rutin) and P7 (quercetin) together accounted for approximately 62.7% of the total integrated peak area, indicating that the EA fraction is markedly enriched in these two flavonoids.</w:t>
-      </w:r>
-    </w:p>
     <w:p>
       <w:pPr>
         <w:spacing w:after="120" w:line="276" w:lineRule="auto"/>
@@ -1997,7 +1975,7 @@
           <w:i w:val="0"/>
           <w:sz w:val="22"/>
         </w:rPr>
-        <w:t>The Rf values of peaks P3 and P7 in the EA fraction were identical (within ±0.01) to the Rf values of the standards rutin (0.42) and quercetin (0.95), respectively, providing the first line of evidence for the presence of both marker compounds in the fraction.</w:t>
+        <w:t>The Rf value of peak P5 in the EA fraction (Rf 0.55) is identical (within ±0.02) to the Rf of the quercetin standard, and P5 is the dominant band of the fraction (~36.6% of the total integrated peak area). This provides the first line of evidence for the presence of quercetin in the sample.</w:t>
       </w:r>
     </w:p>
     <w:p>
@@ -2012,22 +1990,7 @@
           <w:i w:val="0"/>
           <w:sz w:val="26"/>
         </w:rPr>
-        <w:t>5. 2D Overlay and 3D Densitogram</w:t>
-      </w:r>
-    </w:p>
-    <w:p>
-      <w:pPr>
-        <w:keepNext/>
-        <w:spacing w:before="160" w:after="80"/>
-      </w:pPr>
-      <w:r>
-        <w:rPr>
-          <w:rFonts w:ascii="Times New Roman" w:hAnsi="Times New Roman"/>
-          <w:b/>
-          <w:i w:val="0"/>
-          <w:sz w:val="23"/>
-        </w:rPr>
-        <w:t>5.1. 2D overlay (comparative profile)</w:t>
+        <w:t>5. 3D Densitogram (All-Track Comparison)</w:t>
       </w:r>
     </w:p>
     <w:p>
@@ -2042,7 +2005,7 @@
           <w:i w:val="0"/>
           <w:sz w:val="22"/>
         </w:rPr>
-        <w:t>Overlaying the densitograms of the standards on the EA-fraction track allowed direct visual confirmation of band alignment. The vertical reference lines at Rf 0.42 and Rf 0.95 passed exactly through peaks P3 and P7 of the EA fraction, confirming co-migration with rutin and quercetin, respectively.</w:t>
+        <w:t>The 3D densitogram (Figure 3) shows all tracks in a single waterfall-style plot, with the retention factor (Rf) on the x-axis, the track on the y-axis, and the densitometric response (AU) on the z-axis. Track A (Standard) corresponds to quercetin and shows a single dominant ridge at Rf 0.55, while Track B (Sample) shows the multi-peak fingerprint of the EA fraction. The alignment of the quercetin ridge of the standard with the corresponding ridge of the sample confirms the presence of the standard compound in the extract.</w:t>
       </w:r>
     </w:p>
     <w:p>
@@ -2053,8 +2016,8 @@
       <w:r>
         <w:drawing>
           <wp:inline xmlns:a="http://schemas.openxmlformats.org/drawingml/2006/main" xmlns:pic="http://schemas.openxmlformats.org/drawingml/2006/picture">
-            <wp:extent cx="5303520" cy="2835672"/>
-            <wp:docPr id="4" name="Picture 4"/>
+            <wp:extent cx="5486400" cy="5279254"/>
+            <wp:docPr id="3" name="Picture 3"/>
             <wp:cNvGraphicFramePr>
               <a:graphicFrameLocks noChangeAspect="1"/>
             </wp:cNvGraphicFramePr>
@@ -2062,11 +2025,11 @@
               <a:graphicData uri="http://schemas.openxmlformats.org/drawingml/2006/picture">
                 <pic:pic>
                   <pic:nvPicPr>
-                    <pic:cNvPr id="0" name="fig_overlay_2d.png"/>
+                    <pic:cNvPr id="0" name="fig_3d_densitogram.png"/>
                     <pic:cNvPicPr/>
                   </pic:nvPicPr>
                   <pic:blipFill>
-                    <a:blip r:embed="rId12"/>
+                    <a:blip r:embed="rId11"/>
                     <a:stretch>
                       <a:fillRect/>
                     </a:stretch>
@@ -2074,7 +2037,7 @@
                   <pic:spPr>
                     <a:xfrm>
                       <a:off x="0" y="0"/>
-                      <a:ext cx="5303520" cy="2835672"/>
+                      <a:ext cx="5486400" cy="5279254"/>
                     </a:xfrm>
                     <a:prstGeom prst="rect"/>
                   </pic:spPr>
@@ -2097,7 +2060,7 @@
           <w:i w:val="0"/>
           <w:sz w:val="19"/>
         </w:rPr>
-        <w:t>Figure 4.</w:t>
+        <w:t>Figure 3.</w:t>
       </w:r>
       <w:r>
         <w:rPr>
@@ -2106,195 +2069,7 @@
           <w:i/>
           <w:sz w:val="19"/>
         </w:rPr>
-        <w:t xml:space="preserve"> 2D overlay of standard quercetin, standard rutin, and the EA fraction at 366 nm; dashed lines mark Rf 0.42 (rutin) and Rf 0.95 (quercetin).</w:t>
-      </w:r>
-    </w:p>
-    <w:p>
-      <w:pPr>
-        <w:keepNext/>
-        <w:spacing w:before="160" w:after="80"/>
-      </w:pPr>
-      <w:r>
-        <w:rPr>
-          <w:rFonts w:ascii="Times New Roman" w:hAnsi="Times New Roman"/>
-          <w:b/>
-          <w:i w:val="0"/>
-          <w:sz w:val="23"/>
-        </w:rPr>
-        <w:t>5.2. 3D densitogram (all-track comparison)</w:t>
-      </w:r>
-    </w:p>
-    <w:p>
-      <w:pPr>
-        <w:spacing w:after="120" w:line="276" w:lineRule="auto"/>
-        <w:jc w:val="both"/>
-      </w:pPr>
-      <w:r>
-        <w:rPr>
-          <w:rFonts w:ascii="Times New Roman" w:hAnsi="Times New Roman"/>
-          <w:b w:val="0"/>
-          <w:i w:val="0"/>
-          <w:sz w:val="22"/>
-        </w:rPr>
-        <w:t>The 3D densitogram was constructed by plotting the densitometric tracks of all samples along a third (track) axis, producing a waterfall-style surface (Rf on the x-axis, track identity on the y-axis, and absorbance on the z-axis). This visualisation highlights, at a glance, which peaks in the EA fraction align with the single peaks of the pure standards.</w:t>
-      </w:r>
-    </w:p>
-    <w:p>
-      <w:pPr>
-        <w:spacing w:before="120" w:after="40"/>
-        <w:jc w:val="center"/>
-      </w:pPr>
-      <w:r>
-        <w:drawing>
-          <wp:inline xmlns:a="http://schemas.openxmlformats.org/drawingml/2006/main" xmlns:pic="http://schemas.openxmlformats.org/drawingml/2006/picture">
-            <wp:extent cx="5303520" cy="4366234"/>
-            <wp:docPr id="5" name="Picture 5"/>
-            <wp:cNvGraphicFramePr>
-              <a:graphicFrameLocks noChangeAspect="1"/>
-            </wp:cNvGraphicFramePr>
-            <a:graphic>
-              <a:graphicData uri="http://schemas.openxmlformats.org/drawingml/2006/picture">
-                <pic:pic>
-                  <pic:nvPicPr>
-                    <pic:cNvPr id="0" name="fig_3d_densitogram.png"/>
-                    <pic:cNvPicPr/>
-                  </pic:nvPicPr>
-                  <pic:blipFill>
-                    <a:blip r:embed="rId13"/>
-                    <a:stretch>
-                      <a:fillRect/>
-                    </a:stretch>
-                  </pic:blipFill>
-                  <pic:spPr>
-                    <a:xfrm>
-                      <a:off x="0" y="0"/>
-                      <a:ext cx="5303520" cy="4366234"/>
-                    </a:xfrm>
-                    <a:prstGeom prst="rect"/>
-                  </pic:spPr>
-                </pic:pic>
-              </a:graphicData>
-            </a:graphic>
-          </wp:inline>
-        </w:drawing>
-      </w:r>
-    </w:p>
-    <w:p>
-      <w:pPr>
-        <w:spacing w:after="200" w:line="240" w:lineRule="auto"/>
-        <w:jc w:val="center"/>
-      </w:pPr>
-      <w:r>
-        <w:rPr>
-          <w:rFonts w:ascii="Times New Roman" w:hAnsi="Times New Roman"/>
-          <w:b/>
-          <w:i w:val="0"/>
-          <w:sz w:val="19"/>
-        </w:rPr>
-        <w:t>Figure 5.</w:t>
-      </w:r>
-      <w:r>
-        <w:rPr>
-          <w:rFonts w:ascii="Times New Roman" w:hAnsi="Times New Roman"/>
-          <w:b w:val="0"/>
-          <w:i/>
-          <w:sz w:val="19"/>
-        </w:rPr>
-        <w:t xml:space="preserve"> 3D HPTLC densitogram comparing the EA fraction with standards rutin and quercetin at 366 nm; EA-fraction peaks rise at the same Rf positions as the standards.</w:t>
-      </w:r>
-    </w:p>
-    <w:p>
-      <w:pPr>
-        <w:spacing w:after="120" w:line="276" w:lineRule="auto"/>
-        <w:jc w:val="both"/>
-      </w:pPr>
-      <w:r>
-        <w:rPr>
-          <w:rFonts w:ascii="Times New Roman" w:hAnsi="Times New Roman"/>
-          <w:b w:val="0"/>
-          <w:i w:val="0"/>
-          <w:sz w:val="22"/>
-        </w:rPr>
-        <w:t>In the 3D representation, the rutin standard ridge (Rf 0.42) and the quercetin standard ridge (Rf 0.95) lined up vertically with the corresponding ridges of the EA fraction. The additional ridges visible only in the EA-fraction track represent the other native constituents (P1, P2, P4, P5, and P6).</w:t>
-      </w:r>
-    </w:p>
-    <w:p>
-      <w:pPr>
-        <w:keepNext/>
-        <w:spacing w:before="160" w:after="80"/>
-      </w:pPr>
-      <w:r>
-        <w:rPr>
-          <w:rFonts w:ascii="Times New Roman" w:hAnsi="Times New Roman"/>
-          <w:b/>
-          <w:i w:val="0"/>
-          <w:sz w:val="23"/>
-        </w:rPr>
-        <w:t>5.3. Derivatised plate image (366 nm)</w:t>
-      </w:r>
-    </w:p>
-    <w:p>
-      <w:pPr>
-        <w:spacing w:before="120" w:after="40"/>
-        <w:jc w:val="center"/>
-      </w:pPr>
-      <w:r>
-        <w:drawing>
-          <wp:inline xmlns:a="http://schemas.openxmlformats.org/drawingml/2006/main" xmlns:pic="http://schemas.openxmlformats.org/drawingml/2006/picture">
-            <wp:extent cx="3017520" cy="3566519"/>
-            <wp:docPr id="6" name="Picture 6"/>
-            <wp:cNvGraphicFramePr>
-              <a:graphicFrameLocks noChangeAspect="1"/>
-            </wp:cNvGraphicFramePr>
-            <a:graphic>
-              <a:graphicData uri="http://schemas.openxmlformats.org/drawingml/2006/picture">
-                <pic:pic>
-                  <pic:nvPicPr>
-                    <pic:cNvPr id="0" name="fig_plate_image.png"/>
-                    <pic:cNvPicPr/>
-                  </pic:nvPicPr>
-                  <pic:blipFill>
-                    <a:blip r:embed="rId14"/>
-                    <a:stretch>
-                      <a:fillRect/>
-                    </a:stretch>
-                  </pic:blipFill>
-                  <pic:spPr>
-                    <a:xfrm>
-                      <a:off x="0" y="0"/>
-                      <a:ext cx="3017520" cy="3566519"/>
-                    </a:xfrm>
-                    <a:prstGeom prst="rect"/>
-                  </pic:spPr>
-                </pic:pic>
-              </a:graphicData>
-            </a:graphic>
-          </wp:inline>
-        </w:drawing>
-      </w:r>
-    </w:p>
-    <w:p>
-      <w:pPr>
-        <w:spacing w:after="200" w:line="240" w:lineRule="auto"/>
-        <w:jc w:val="center"/>
-      </w:pPr>
-      <w:r>
-        <w:rPr>
-          <w:rFonts w:ascii="Times New Roman" w:hAnsi="Times New Roman"/>
-          <w:b/>
-          <w:i w:val="0"/>
-          <w:sz w:val="19"/>
-        </w:rPr>
-        <w:t>Figure 6.</w:t>
-      </w:r>
-      <w:r>
-        <w:rPr>
-          <w:rFonts w:ascii="Times New Roman" w:hAnsi="Times New Roman"/>
-          <w:b w:val="0"/>
-          <w:i/>
-          <w:sz w:val="19"/>
-        </w:rPr>
-        <w:t xml:space="preserve"> Schematic of the developed and NP–PEG-derivatised plate under 366 nm, showing band positions for the standards and the EA fraction.</w:t>
+        <w:t xml:space="preserve"> 3D HPTLC densitogram showing all tracks in 3D form and showing the presence of the standard in the sample. A. Standard (quercetin); B. Sample (EA fraction of S. trilobata).</w:t>
       </w:r>
     </w:p>
     <w:p>
@@ -2309,7 +2084,7 @@
           <w:i w:val="0"/>
           <w:sz w:val="26"/>
         </w:rPr>
-        <w:t>6. Comparative Rf and Identification Summary</w:t>
+        <w:t>6. Identification Summary</w:t>
       </w:r>
     </w:p>
     <w:p>
@@ -2504,7 +2279,7 @@
                 <w:i w:val="0"/>
                 <w:sz w:val="20"/>
               </w:rPr>
-              <w:t>0.95</w:t>
+              <w:t>0.55</w:t>
             </w:r>
           </w:p>
         </w:tc>
@@ -2524,109 +2299,7 @@
                 <w:i w:val="0"/>
                 <w:sz w:val="20"/>
               </w:rPr>
-              <w:t>0.95 (P7)</w:t>
-            </w:r>
-          </w:p>
-        </w:tc>
-        <w:tc>
-          <w:tcPr>
-            <w:tcW w:type="dxa" w:w="1805"/>
-          </w:tcPr>
-          <w:p>
-            <w:pPr>
-              <w:spacing w:before="20" w:after="20" w:line="240" w:lineRule="auto"/>
-            </w:pPr>
-            <w:r/>
-            <w:r>
-              <w:rPr>
-                <w:rFonts w:ascii="Times New Roman" w:hAnsi="Times New Roman"/>
-                <w:b w:val="0"/>
-                <w:i w:val="0"/>
-                <w:sz w:val="20"/>
-              </w:rPr>
-              <w:t>0.00</w:t>
-            </w:r>
-          </w:p>
-        </w:tc>
-        <w:tc>
-          <w:tcPr>
-            <w:tcW w:type="dxa" w:w="1805"/>
-          </w:tcPr>
-          <w:p>
-            <w:pPr>
-              <w:spacing w:before="20" w:after="20" w:line="240" w:lineRule="auto"/>
-            </w:pPr>
-            <w:r/>
-            <w:r>
-              <w:rPr>
-                <w:rFonts w:ascii="Times New Roman" w:hAnsi="Times New Roman"/>
-                <w:b w:val="0"/>
-                <w:i w:val="0"/>
-                <w:sz w:val="20"/>
-              </w:rPr>
-              <w:t>Confirmed</w:t>
-            </w:r>
-          </w:p>
-        </w:tc>
-      </w:tr>
-      <w:tr>
-        <w:tc>
-          <w:tcPr>
-            <w:tcW w:type="dxa" w:w="1805"/>
-          </w:tcPr>
-          <w:p>
-            <w:pPr>
-              <w:spacing w:before="20" w:after="20" w:line="240" w:lineRule="auto"/>
-            </w:pPr>
-            <w:r/>
-            <w:r>
-              <w:rPr>
-                <w:rFonts w:ascii="Times New Roman" w:hAnsi="Times New Roman"/>
-                <w:b/>
-                <w:i w:val="0"/>
-                <w:sz w:val="20"/>
-              </w:rPr>
-              <w:t>Rutin</w:t>
-            </w:r>
-          </w:p>
-        </w:tc>
-        <w:tc>
-          <w:tcPr>
-            <w:tcW w:type="dxa" w:w="1805"/>
-          </w:tcPr>
-          <w:p>
-            <w:pPr>
-              <w:spacing w:before="20" w:after="20" w:line="240" w:lineRule="auto"/>
-            </w:pPr>
-            <w:r/>
-            <w:r>
-              <w:rPr>
-                <w:rFonts w:ascii="Times New Roman" w:hAnsi="Times New Roman"/>
-                <w:b w:val="0"/>
-                <w:i w:val="0"/>
-                <w:sz w:val="20"/>
-              </w:rPr>
-              <w:t>0.42</w:t>
-            </w:r>
-          </w:p>
-        </w:tc>
-        <w:tc>
-          <w:tcPr>
-            <w:tcW w:type="dxa" w:w="1805"/>
-          </w:tcPr>
-          <w:p>
-            <w:pPr>
-              <w:spacing w:before="20" w:after="20" w:line="240" w:lineRule="auto"/>
-            </w:pPr>
-            <w:r/>
-            <w:r>
-              <w:rPr>
-                <w:rFonts w:ascii="Times New Roman" w:hAnsi="Times New Roman"/>
-                <w:b w:val="0"/>
-                <w:i w:val="0"/>
-                <w:sz w:val="20"/>
-              </w:rPr>
-              <w:t>0.42 (P3)</w:t>
+              <w:t>0.55 (P5)</w:t>
             </w:r>
           </w:p>
         </w:tc>
@@ -2709,14 +2382,13 @@
         </w:tblCellMar>
       </w:tblPr>
       <w:tblGrid>
-        <w:gridCol w:w="3009"/>
-        <w:gridCol w:w="3009"/>
-        <w:gridCol w:w="3009"/>
+        <w:gridCol w:w="4513"/>
+        <w:gridCol w:w="4513"/>
       </w:tblGrid>
       <w:tr>
         <w:tc>
           <w:tcPr>
-            <w:tcW w:type="dxa" w:w="3009"/>
+            <w:tcW w:type="dxa" w:w="4513"/>
             <w:shd w:fill="D9D9D9"/>
           </w:tcPr>
           <w:p>
@@ -2738,7 +2410,7 @@
         </w:tc>
         <w:tc>
           <w:tcPr>
-            <w:tcW w:type="dxa" w:w="3009"/>
+            <w:tcW w:type="dxa" w:w="4513"/>
             <w:shd w:fill="D9D9D9"/>
           </w:tcPr>
           <w:p>
@@ -2754,29 +2426,7 @@
                 <w:i w:val="0"/>
                 <w:sz w:val="20"/>
               </w:rPr>
-              <w:t>Quercetin (P7)</w:t>
-            </w:r>
-          </w:p>
-        </w:tc>
-        <w:tc>
-          <w:tcPr>
-            <w:tcW w:type="dxa" w:w="3009"/>
-            <w:shd w:fill="D9D9D9"/>
-          </w:tcPr>
-          <w:p>
-            <w:pPr>
-              <w:spacing w:before="20" w:after="20" w:line="240" w:lineRule="auto"/>
-              <w:jc w:val="center"/>
-            </w:pPr>
-            <w:r/>
-            <w:r>
-              <w:rPr>
-                <w:rFonts w:ascii="Times New Roman" w:hAnsi="Times New Roman"/>
-                <w:b/>
-                <w:i w:val="0"/>
-                <w:sz w:val="20"/>
-              </w:rPr>
-              <w:t>Rutin (P3)</w:t>
+              <w:t>Quercetin (P5)</w:t>
             </w:r>
           </w:p>
         </w:tc>
@@ -2784,7 +2434,7 @@
       <w:tr>
         <w:tc>
           <w:tcPr>
-            <w:tcW w:type="dxa" w:w="3009"/>
+            <w:tcW w:type="dxa" w:w="4513"/>
           </w:tcPr>
           <w:p>
             <w:pPr>
@@ -2804,7 +2454,7 @@
         </w:tc>
         <w:tc>
           <w:tcPr>
-            <w:tcW w:type="dxa" w:w="3009"/>
+            <w:tcW w:type="dxa" w:w="4513"/>
           </w:tcPr>
           <w:p>
             <w:pPr>
@@ -2818,27 +2468,7 @@
                 <w:i w:val="0"/>
                 <w:sz w:val="20"/>
               </w:rPr>
-              <w:t>Yes (Rf 0.95)</w:t>
-            </w:r>
-          </w:p>
-        </w:tc>
-        <w:tc>
-          <w:tcPr>
-            <w:tcW w:type="dxa" w:w="3009"/>
-          </w:tcPr>
-          <w:p>
-            <w:pPr>
-              <w:spacing w:before="20" w:after="20" w:line="240" w:lineRule="auto"/>
-            </w:pPr>
-            <w:r/>
-            <w:r>
-              <w:rPr>
-                <w:rFonts w:ascii="Times New Roman" w:hAnsi="Times New Roman"/>
-                <w:b w:val="0"/>
-                <w:i w:val="0"/>
-                <w:sz w:val="20"/>
-              </w:rPr>
-              <w:t>Yes (Rf 0.42)</w:t>
+              <w:t>Yes (Rf 0.55)</w:t>
             </w:r>
           </w:p>
         </w:tc>
@@ -2846,7 +2476,7 @@
       <w:tr>
         <w:tc>
           <w:tcPr>
-            <w:tcW w:type="dxa" w:w="3009"/>
+            <w:tcW w:type="dxa" w:w="4513"/>
           </w:tcPr>
           <w:p>
             <w:pPr>
@@ -2866,27 +2496,7 @@
         </w:tc>
         <w:tc>
           <w:tcPr>
-            <w:tcW w:type="dxa" w:w="3009"/>
-          </w:tcPr>
-          <w:p>
-            <w:pPr>
-              <w:spacing w:before="20" w:after="20" w:line="240" w:lineRule="auto"/>
-            </w:pPr>
-            <w:r/>
-            <w:r>
-              <w:rPr>
-                <w:rFonts w:ascii="Times New Roman" w:hAnsi="Times New Roman"/>
-                <w:b w:val="0"/>
-                <w:i w:val="0"/>
-                <w:sz w:val="20"/>
-              </w:rPr>
-              <w:t>Single intensified band; no splitting</w:t>
-            </w:r>
-          </w:p>
-        </w:tc>
-        <w:tc>
-          <w:tcPr>
-            <w:tcW w:type="dxa" w:w="3009"/>
+            <w:tcW w:type="dxa" w:w="4513"/>
           </w:tcPr>
           <w:p>
             <w:pPr>
@@ -2908,7 +2518,7 @@
       <w:tr>
         <w:tc>
           <w:tcPr>
-            <w:tcW w:type="dxa" w:w="3009"/>
+            <w:tcW w:type="dxa" w:w="4513"/>
           </w:tcPr>
           <w:p>
             <w:pPr>
@@ -2928,7 +2538,7 @@
         </w:tc>
         <w:tc>
           <w:tcPr>
-            <w:tcW w:type="dxa" w:w="3009"/>
+            <w:tcW w:type="dxa" w:w="4513"/>
           </w:tcPr>
           <w:p>
             <w:pPr>
@@ -2946,31 +2556,11 @@
             </w:r>
           </w:p>
         </w:tc>
-        <w:tc>
-          <w:tcPr>
-            <w:tcW w:type="dxa" w:w="3009"/>
-          </w:tcPr>
-          <w:p>
-            <w:pPr>
-              <w:spacing w:before="20" w:after="20" w:line="240" w:lineRule="auto"/>
-            </w:pPr>
-            <w:r/>
-            <w:r>
-              <w:rPr>
-                <w:rFonts w:ascii="Times New Roman" w:hAnsi="Times New Roman"/>
-                <w:b w:val="0"/>
-                <w:i w:val="0"/>
-                <w:sz w:val="20"/>
-              </w:rPr>
-              <w:t>Orange-yellow fluorescence</w:t>
-            </w:r>
-          </w:p>
-        </w:tc>
       </w:tr>
       <w:tr>
         <w:tc>
           <w:tcPr>
-            <w:tcW w:type="dxa" w:w="3009"/>
+            <w:tcW w:type="dxa" w:w="4513"/>
           </w:tcPr>
           <w:p>
             <w:pPr>
@@ -2990,27 +2580,7 @@
         </w:tc>
         <w:tc>
           <w:tcPr>
-            <w:tcW w:type="dxa" w:w="3009"/>
-          </w:tcPr>
-          <w:p>
-            <w:pPr>
-              <w:spacing w:before="20" w:after="20" w:line="240" w:lineRule="auto"/>
-            </w:pPr>
-            <w:r/>
-            <w:r>
-              <w:rPr>
-                <w:rFonts w:ascii="Times New Roman" w:hAnsi="Times New Roman"/>
-                <w:b w:val="0"/>
-                <w:i w:val="0"/>
-                <w:sz w:val="20"/>
-              </w:rPr>
-              <w:t>Superimposable with standard</w:t>
-            </w:r>
-          </w:p>
-        </w:tc>
-        <w:tc>
-          <w:tcPr>
-            <w:tcW w:type="dxa" w:w="3009"/>
+            <w:tcW w:type="dxa" w:w="4513"/>
           </w:tcPr>
           <w:p>
             <w:pPr>
@@ -3032,7 +2602,7 @@
       <w:tr>
         <w:tc>
           <w:tcPr>
-            <w:tcW w:type="dxa" w:w="3009"/>
+            <w:tcW w:type="dxa" w:w="4513"/>
           </w:tcPr>
           <w:p>
             <w:pPr>
@@ -3052,27 +2622,7 @@
         </w:tc>
         <w:tc>
           <w:tcPr>
-            <w:tcW w:type="dxa" w:w="3009"/>
-          </w:tcPr>
-          <w:p>
-            <w:pPr>
-              <w:spacing w:before="20" w:after="20" w:line="240" w:lineRule="auto"/>
-            </w:pPr>
-            <w:r/>
-            <w:r>
-              <w:rPr>
-                <w:rFonts w:ascii="Times New Roman" w:hAnsi="Times New Roman"/>
-                <w:b w:val="0"/>
-                <w:i w:val="0"/>
-                <w:sz w:val="20"/>
-              </w:rPr>
-              <w:t>r &gt; 0.999</w:t>
-            </w:r>
-          </w:p>
-        </w:tc>
-        <w:tc>
-          <w:tcPr>
-            <w:tcW w:type="dxa" w:w="3009"/>
+            <w:tcW w:type="dxa" w:w="4513"/>
           </w:tcPr>
           <w:p>
             <w:pPr>
@@ -3104,7 +2654,7 @@
           <w:i w:val="0"/>
           <w:sz w:val="22"/>
         </w:rPr>
-        <w:t>When the EA fraction was co-applied (spiked) with each standard on the same band, the corresponding peaks (P3 with rutin; P7 with quercetin) showed a single intensified band with no peak splitting or shoulder formation and no change in Rf. This provides conclusive secondary confirmation that P3 corresponds to rutin and P7 to quercetin.</w:t>
+        <w:t>When the EA fraction was co-applied (spiked) with the quercetin standard on the same band, the corresponding peak (P5) showed a single intensified band with no peak splitting or shoulder formation and no change in Rf. This provides conclusive secondary confirmation that P5 corresponds to quercetin.</w:t>
       </w:r>
     </w:p>
     <w:p>
@@ -3144,15 +2694,14 @@
         </w:tblCellMar>
       </w:tblPr>
       <w:tblGrid>
-        <w:gridCol w:w="2256"/>
-        <w:gridCol w:w="2256"/>
-        <w:gridCol w:w="2256"/>
-        <w:gridCol w:w="2256"/>
+        <w:gridCol w:w="3009"/>
+        <w:gridCol w:w="3009"/>
+        <w:gridCol w:w="3009"/>
       </w:tblGrid>
       <w:tr>
         <w:tc>
           <w:tcPr>
-            <w:tcW w:type="dxa" w:w="2256"/>
+            <w:tcW w:type="dxa" w:w="3009"/>
             <w:shd w:fill="D9D9D9"/>
           </w:tcPr>
           <w:p>
@@ -3174,7 +2723,7 @@
         </w:tc>
         <w:tc>
           <w:tcPr>
-            <w:tcW w:type="dxa" w:w="2256"/>
+            <w:tcW w:type="dxa" w:w="3009"/>
             <w:shd w:fill="D9D9D9"/>
           </w:tcPr>
           <w:p>
@@ -3196,29 +2745,7 @@
         </w:tc>
         <w:tc>
           <w:tcPr>
-            <w:tcW w:type="dxa" w:w="2256"/>
-            <w:shd w:fill="D9D9D9"/>
-          </w:tcPr>
-          <w:p>
-            <w:pPr>
-              <w:spacing w:before="20" w:after="20" w:line="240" w:lineRule="auto"/>
-              <w:jc w:val="center"/>
-            </w:pPr>
-            <w:r/>
-            <w:r>
-              <w:rPr>
-                <w:rFonts w:ascii="Times New Roman" w:hAnsi="Times New Roman"/>
-                <w:b/>
-                <w:i w:val="0"/>
-                <w:sz w:val="20"/>
-              </w:rPr>
-              <w:t>Rutin</w:t>
-            </w:r>
-          </w:p>
-        </w:tc>
-        <w:tc>
-          <w:tcPr>
-            <w:tcW w:type="dxa" w:w="2256"/>
+            <w:tcW w:type="dxa" w:w="3009"/>
             <w:shd w:fill="D9D9D9"/>
           </w:tcPr>
           <w:p>
@@ -3242,7 +2769,7 @@
       <w:tr>
         <w:tc>
           <w:tcPr>
-            <w:tcW w:type="dxa" w:w="2256"/>
+            <w:tcW w:type="dxa" w:w="3009"/>
           </w:tcPr>
           <w:p>
             <w:pPr>
@@ -3262,7 +2789,7 @@
         </w:tc>
         <w:tc>
           <w:tcPr>
-            <w:tcW w:type="dxa" w:w="2256"/>
+            <w:tcW w:type="dxa" w:w="3009"/>
           </w:tcPr>
           <w:p>
             <w:pPr>
@@ -3276,33 +2803,13 @@
                 <w:i w:val="0"/>
                 <w:sz w:val="20"/>
               </w:rPr>
-              <w:t>0.95</w:t>
+              <w:t>0.55</w:t>
             </w:r>
           </w:p>
         </w:tc>
         <w:tc>
           <w:tcPr>
-            <w:tcW w:type="dxa" w:w="2256"/>
-          </w:tcPr>
-          <w:p>
-            <w:pPr>
-              <w:spacing w:before="20" w:after="20" w:line="240" w:lineRule="auto"/>
-            </w:pPr>
-            <w:r/>
-            <w:r>
-              <w:rPr>
-                <w:rFonts w:ascii="Times New Roman" w:hAnsi="Times New Roman"/>
-                <w:b w:val="0"/>
-                <w:i w:val="0"/>
-                <w:sz w:val="20"/>
-              </w:rPr>
-              <w:t>0.42</w:t>
-            </w:r>
-          </w:p>
-        </w:tc>
-        <w:tc>
-          <w:tcPr>
-            <w:tcW w:type="dxa" w:w="2256"/>
+            <w:tcW w:type="dxa" w:w="3009"/>
           </w:tcPr>
           <w:p>
             <w:pPr>
@@ -3324,7 +2831,7 @@
       <w:tr>
         <w:tc>
           <w:tcPr>
-            <w:tcW w:type="dxa" w:w="2256"/>
+            <w:tcW w:type="dxa" w:w="3009"/>
           </w:tcPr>
           <w:p>
             <w:pPr>
@@ -3344,7 +2851,7 @@
         </w:tc>
         <w:tc>
           <w:tcPr>
-            <w:tcW w:type="dxa" w:w="2256"/>
+            <w:tcW w:type="dxa" w:w="3009"/>
           </w:tcPr>
           <w:p>
             <w:pPr>
@@ -3358,33 +2865,13 @@
                 <w:i w:val="0"/>
                 <w:sz w:val="20"/>
               </w:rPr>
-              <w:t>2.6</w:t>
+              <w:t>2.4</w:t>
             </w:r>
           </w:p>
         </w:tc>
         <w:tc>
           <w:tcPr>
-            <w:tcW w:type="dxa" w:w="2256"/>
-          </w:tcPr>
-          <w:p>
-            <w:pPr>
-              <w:spacing w:before="20" w:after="20" w:line="240" w:lineRule="auto"/>
-            </w:pPr>
-            <w:r/>
-            <w:r>
-              <w:rPr>
-                <w:rFonts w:ascii="Times New Roman" w:hAnsi="Times New Roman"/>
-                <w:b w:val="0"/>
-                <w:i w:val="0"/>
-                <w:sz w:val="20"/>
-              </w:rPr>
-              <w:t>1.9</w:t>
-            </w:r>
-          </w:p>
-        </w:tc>
-        <w:tc>
-          <w:tcPr>
-            <w:tcW w:type="dxa" w:w="2256"/>
+            <w:tcW w:type="dxa" w:w="3009"/>
           </w:tcPr>
           <w:p>
             <w:pPr>
@@ -3406,7 +2893,7 @@
       <w:tr>
         <w:tc>
           <w:tcPr>
-            <w:tcW w:type="dxa" w:w="2256"/>
+            <w:tcW w:type="dxa" w:w="3009"/>
           </w:tcPr>
           <w:p>
             <w:pPr>
@@ -3426,7 +2913,7 @@
         </w:tc>
         <w:tc>
           <w:tcPr>
-            <w:tcW w:type="dxa" w:w="2256"/>
+            <w:tcW w:type="dxa" w:w="3009"/>
           </w:tcPr>
           <w:p>
             <w:pPr>
@@ -3440,33 +2927,13 @@
                 <w:i w:val="0"/>
                 <w:sz w:val="20"/>
               </w:rPr>
-              <w:t>1.04</w:t>
+              <w:t>1.05</w:t>
             </w:r>
           </w:p>
         </w:tc>
         <w:tc>
           <w:tcPr>
-            <w:tcW w:type="dxa" w:w="2256"/>
-          </w:tcPr>
-          <w:p>
-            <w:pPr>
-              <w:spacing w:before="20" w:after="20" w:line="240" w:lineRule="auto"/>
-            </w:pPr>
-            <w:r/>
-            <w:r>
-              <w:rPr>
-                <w:rFonts w:ascii="Times New Roman" w:hAnsi="Times New Roman"/>
-                <w:b w:val="0"/>
-                <w:i w:val="0"/>
-                <w:sz w:val="20"/>
-              </w:rPr>
-              <w:t>1.08</w:t>
-            </w:r>
-          </w:p>
-        </w:tc>
-        <w:tc>
-          <w:tcPr>
-            <w:tcW w:type="dxa" w:w="2256"/>
+            <w:tcW w:type="dxa" w:w="3009"/>
           </w:tcPr>
           <w:p>
             <w:pPr>
@@ -3488,7 +2955,7 @@
       <w:tr>
         <w:tc>
           <w:tcPr>
-            <w:tcW w:type="dxa" w:w="2256"/>
+            <w:tcW w:type="dxa" w:w="3009"/>
           </w:tcPr>
           <w:p>
             <w:pPr>
@@ -3508,7 +2975,7 @@
         </w:tc>
         <w:tc>
           <w:tcPr>
-            <w:tcW w:type="dxa" w:w="2256"/>
+            <w:tcW w:type="dxa" w:w="3009"/>
           </w:tcPr>
           <w:p>
             <w:pPr>
@@ -3522,33 +2989,13 @@
                 <w:i w:val="0"/>
                 <w:sz w:val="20"/>
               </w:rPr>
-              <w:t>4180</w:t>
+              <w:t>3960</w:t>
             </w:r>
           </w:p>
         </w:tc>
         <w:tc>
           <w:tcPr>
-            <w:tcW w:type="dxa" w:w="2256"/>
-          </w:tcPr>
-          <w:p>
-            <w:pPr>
-              <w:spacing w:before="20" w:after="20" w:line="240" w:lineRule="auto"/>
-            </w:pPr>
-            <w:r/>
-            <w:r>
-              <w:rPr>
-                <w:rFonts w:ascii="Times New Roman" w:hAnsi="Times New Roman"/>
-                <w:b w:val="0"/>
-                <w:i w:val="0"/>
-                <w:sz w:val="20"/>
-              </w:rPr>
-              <w:t>3650</w:t>
-            </w:r>
-          </w:p>
-        </w:tc>
-        <w:tc>
-          <w:tcPr>
-            <w:tcW w:type="dxa" w:w="2256"/>
+            <w:tcW w:type="dxa" w:w="3009"/>
           </w:tcPr>
           <w:p>
             <w:pPr>
@@ -3570,7 +3017,7 @@
       <w:tr>
         <w:tc>
           <w:tcPr>
-            <w:tcW w:type="dxa" w:w="2256"/>
+            <w:tcW w:type="dxa" w:w="3009"/>
           </w:tcPr>
           <w:p>
             <w:pPr>
@@ -3590,7 +3037,7 @@
         </w:tc>
         <w:tc>
           <w:tcPr>
-            <w:tcW w:type="dxa" w:w="2256"/>
+            <w:tcW w:type="dxa" w:w="3009"/>
           </w:tcPr>
           <w:p>
             <w:pPr>
@@ -3604,33 +3051,13 @@
                 <w:i w:val="0"/>
                 <w:sz w:val="20"/>
               </w:rPr>
-              <w:t>0.9987</w:t>
+              <w:t>0.9989</w:t>
             </w:r>
           </w:p>
         </w:tc>
         <w:tc>
           <w:tcPr>
-            <w:tcW w:type="dxa" w:w="2256"/>
-          </w:tcPr>
-          <w:p>
-            <w:pPr>
-              <w:spacing w:before="20" w:after="20" w:line="240" w:lineRule="auto"/>
-            </w:pPr>
-            <w:r/>
-            <w:r>
-              <w:rPr>
-                <w:rFonts w:ascii="Times New Roman" w:hAnsi="Times New Roman"/>
-                <w:b w:val="0"/>
-                <w:i w:val="0"/>
-                <w:sz w:val="20"/>
-              </w:rPr>
-              <w:t>0.9991</w:t>
-            </w:r>
-          </w:p>
-        </w:tc>
-        <w:tc>
-          <w:tcPr>
-            <w:tcW w:type="dxa" w:w="2256"/>
+            <w:tcW w:type="dxa" w:w="3009"/>
           </w:tcPr>
           <w:p>
             <w:pPr>
@@ -3652,7 +3079,7 @@
       <w:tr>
         <w:tc>
           <w:tcPr>
-            <w:tcW w:type="dxa" w:w="2256"/>
+            <w:tcW w:type="dxa" w:w="3009"/>
           </w:tcPr>
           <w:p>
             <w:pPr>
@@ -3672,7 +3099,7 @@
         </w:tc>
         <w:tc>
           <w:tcPr>
-            <w:tcW w:type="dxa" w:w="2256"/>
+            <w:tcW w:type="dxa" w:w="3009"/>
           </w:tcPr>
           <w:p>
             <w:pPr>
@@ -3686,33 +3113,13 @@
                 <w:i w:val="0"/>
                 <w:sz w:val="20"/>
               </w:rPr>
-              <w:t>21</w:t>
+              <w:t>23</w:t>
             </w:r>
           </w:p>
         </w:tc>
         <w:tc>
           <w:tcPr>
-            <w:tcW w:type="dxa" w:w="2256"/>
-          </w:tcPr>
-          <w:p>
-            <w:pPr>
-              <w:spacing w:before="20" w:after="20" w:line="240" w:lineRule="auto"/>
-            </w:pPr>
-            <w:r/>
-            <w:r>
-              <w:rPr>
-                <w:rFonts w:ascii="Times New Roman" w:hAnsi="Times New Roman"/>
-                <w:b w:val="0"/>
-                <w:i w:val="0"/>
-                <w:sz w:val="20"/>
-              </w:rPr>
-              <w:t>34</w:t>
-            </w:r>
-          </w:p>
-        </w:tc>
-        <w:tc>
-          <w:tcPr>
-            <w:tcW w:type="dxa" w:w="2256"/>
+            <w:tcW w:type="dxa" w:w="3009"/>
           </w:tcPr>
           <w:p>
             <w:pPr>
@@ -3734,7 +3141,7 @@
       <w:tr>
         <w:tc>
           <w:tcPr>
-            <w:tcW w:type="dxa" w:w="2256"/>
+            <w:tcW w:type="dxa" w:w="3009"/>
           </w:tcPr>
           <w:p>
             <w:pPr>
@@ -3754,7 +3161,7 @@
         </w:tc>
         <w:tc>
           <w:tcPr>
-            <w:tcW w:type="dxa" w:w="2256"/>
+            <w:tcW w:type="dxa" w:w="3009"/>
           </w:tcPr>
           <w:p>
             <w:pPr>
@@ -3768,33 +3175,13 @@
                 <w:i w:val="0"/>
                 <w:sz w:val="20"/>
               </w:rPr>
-              <w:t>64</w:t>
+              <w:t>70</w:t>
             </w:r>
           </w:p>
         </w:tc>
         <w:tc>
           <w:tcPr>
-            <w:tcW w:type="dxa" w:w="2256"/>
-          </w:tcPr>
-          <w:p>
-            <w:pPr>
-              <w:spacing w:before="20" w:after="20" w:line="240" w:lineRule="auto"/>
-            </w:pPr>
-            <w:r/>
-            <w:r>
-              <w:rPr>
-                <w:rFonts w:ascii="Times New Roman" w:hAnsi="Times New Roman"/>
-                <w:b w:val="0"/>
-                <w:i w:val="0"/>
-                <w:sz w:val="20"/>
-              </w:rPr>
-              <w:t>103</w:t>
-            </w:r>
-          </w:p>
-        </w:tc>
-        <w:tc>
-          <w:tcPr>
-            <w:tcW w:type="dxa" w:w="2256"/>
+            <w:tcW w:type="dxa" w:w="3009"/>
           </w:tcPr>
           <w:p>
             <w:pPr>
@@ -3826,7 +3213,7 @@
           <w:i w:val="0"/>
           <w:sz w:val="22"/>
         </w:rPr>
-        <w:t>All system-suitability parameters were within acceptable limits, demonstrating that the developed HPTLC method is specific, precise, and suitable for the qualitative fingerprinting and identification of quercetin and rutin in the EA fraction of S. trilobata.</w:t>
+        <w:t>All system-suitability parameters were within acceptable limits, demonstrating that the developed HPTLC method is specific, precise, and suitable for the qualitative fingerprinting and identification of quercetin in the EA fraction of S. trilobata.</w:t>
       </w:r>
     </w:p>
     <w:p>
@@ -3856,7 +3243,7 @@
           <w:i w:val="0"/>
           <w:sz w:val="22"/>
         </w:rPr>
-        <w:t>The HPTLC fingerprint of the ethyl acetate fraction of the S. trilobata methanol extract is consistent with a flavonoid-rich profile. The comparison—in both the 2D densitometric and the 3D overlay modes—established an unambiguous correspondence between two of the seven native bands and the reference standards. The aglycone quercetin, being less polar, migrated close to the solvent front (Rf 0.95), whereas the glycoside rutin, owing to its sugar moiety and consequently higher polarity, was retained near the origin (Rf 0.42). This polarity-based separation behaviour is in agreement with the expected normal-phase chromatographic order on silica gel.</w:t>
+        <w:t>The HPTLC fingerprint of the ethyl acetate fraction of the S. trilobata methanol extract is consistent with a flavonoid-rich profile. The comparison—across the developed plate, the 2D densitometric profiles, and the 3D overlay—established an unambiguous correspondence between one of the native bands of the fraction and the quercetin reference standard. The aglycone quercetin migrated as a single, well-resolved band at Rf 0.55 under the normal-phase silica gel system, and the corresponding band in the sample matched it in Rf, fluorescence colour, and UV spectrum.</w:t>
       </w:r>
     </w:p>
     <w:p>
@@ -3871,7 +3258,7 @@
           <w:i w:val="0"/>
           <w:sz w:val="22"/>
         </w:rPr>
-        <w:t>The observation that quercetin (P7, ~33% area) and rutin (P3, ~30% area) were the two dominant bands of the EA fraction suggests that the ethyl acetate fractionation step is highly effective for enriching these therapeutically relevant flavonoids. Their combined presence may rationalise the reported antioxidant, anti-inflammatory, and hepatoprotective activities of the plant, since both quercetin and rutin are established free-radical scavengers.</w:t>
+        <w:t>The observation that quercetin (peak P5, ~36.6% area) was the dominant band of the EA fraction suggests that the ethyl acetate fractionation step is highly effective for enriching this therapeutically relevant flavonoid. The presence of quercetin may rationalise the reported antioxidant, anti-inflammatory, and hepatoprotective activities of the plant, since quercetin is an established free-radical scavenger.</w:t>
       </w:r>
     </w:p>
     <w:p>
@@ -3901,7 +3288,7 @@
           <w:i w:val="0"/>
           <w:sz w:val="22"/>
         </w:rPr>
-        <w:t>A simple, precise, and specific HPTLC method was developed and applied to fingerprint the ethyl acetate fraction of the methanol extract of Sphagneticola trilobata (Wedelia trilobata). The 2D and 3D densitograms, supported by Rf matching, co-chromatography, and spectral overlay, conclusively confirmed the presence of the flavonoids quercetin (Rf 0.95) and rutin (Rf 0.42) as major constituents of the fraction. The method is reproducible and may be adopted as a quality-control fingerprint and for the simultaneous marker-based standardisation of S. trilobata preparations.</w:t>
+        <w:t>A simple, precise, and specific HPTLC method was developed and applied to fingerprint the ethyl acetate fraction of the methanol extract of Sphagneticola trilobata (Wedelia trilobata). The HPTLC plate, the 2D densitograms, and the 3D densitogram, supported by Rf matching, co-chromatography, and spectral overlay, conclusively confirmed the presence of the flavonoid quercetin (Rf 0.55) as a major constituent of the fraction. The method is reproducible and may be adopted as a quality-control fingerprint and for the marker-based standardisation of S. trilobata preparations.</w:t>
       </w:r>
     </w:p>
     <w:p>
@@ -4006,7 +3393,7 @@
           <w:i w:val="0"/>
           <w:sz w:val="20"/>
         </w:rPr>
-        <w:t>[6] Reported HPTLC densitometric methods employing toluene : ethyl acetate : formic acid mobile phases for the determination of quercetin and rutin in plant extracts.</w:t>
+        <w:t>[6] Reported HPTLC densitometric methods employing toluene : ethyl acetate : formic acid mobile phases for the determination of quercetin in plant extracts.</w:t>
       </w:r>
     </w:p>
     <w:p>
@@ -4021,7 +3408,7 @@
           <w:i/>
           <w:sz w:val="19"/>
         </w:rPr>
-        <w:t>Note: The densitograms and tabulated values presented here are representative figures prepared to illustrate the expected 2D/3D HPTLC profile and comparison. They should be replaced with the actual instrument-exported densitograms and integrated data from your laboratory runs before final submission.</w:t>
+        <w:t>Note: The plate image, densitograms, and tabulated values presented here are representative figures prepared to illustrate the expected HPTLC / 2D / 3D profile and comparison. They should be replaced with the actual instrument-exported plate photograph, densitograms, and integrated data from your laboratory runs before final submission.</w:t>
       </w:r>
     </w:p>
     <w:sectPr>

</xml_diff>